<commit_message>
October 18, 2026 - 2
</commit_message>
<xml_diff>
--- a/assets/resume/Ravi Kumar Gupta - SAP AI.docx
+++ b/assets/resume/Ravi Kumar Gupta - SAP AI.docx
@@ -41,31 +41,89 @@
               <w:spacing w:after="20"/>
               <w:rPr>
                 <w:b/>
+                <w:color w:val="000000" w:themeColor="text1"/>
                 <w:sz w:val="36"/>
               </w:rPr>
             </w:pPr>
             <w:r>
               <w:rPr>
                 <w:b/>
+                <w:color w:val="000000" w:themeColor="text1"/>
                 <w:sz w:val="36"/>
               </w:rPr>
+              <w:fldChar w:fldCharType="begin"/>
+            </w:r>
+            <w:r>
+              <w:rPr>
+                <w:b/>
+                <w:color w:val="000000" w:themeColor="text1"/>
+                <w:sz w:val="36"/>
+              </w:rPr>
+              <w:instrText>HYPERLINK "https://rgravigupta91.github.io/Ravi-Gupta/"</w:instrText>
+            </w:r>
+            <w:r>
+              <w:rPr>
+                <w:b/>
+                <w:color w:val="000000" w:themeColor="text1"/>
+                <w:sz w:val="36"/>
+              </w:rPr>
+            </w:r>
+            <w:r>
+              <w:rPr>
+                <w:b/>
+                <w:color w:val="000000" w:themeColor="text1"/>
+                <w:sz w:val="36"/>
+              </w:rPr>
+              <w:fldChar w:fldCharType="separate"/>
+            </w:r>
+            <w:r>
+              <w:rPr>
+                <w:rStyle w:val="Hyperlink"/>
+                <w:b/>
+                <w:color w:val="000000" w:themeColor="text1"/>
+                <w:sz w:val="36"/>
+                <w:u w:val="none"/>
+              </w:rPr>
               <w:t>RAVI</w:t>
             </w:r>
             <w:r>
               <w:rPr>
+                <w:rStyle w:val="Hyperlink"/>
                 <w:b/>
+                <w:color w:val="000000" w:themeColor="text1"/>
                 <w:sz w:val="36"/>
-              </w:rPr>
-              <w:br/>
+                <w:u w:val="none"/>
+              </w:rPr>
+              <w:t xml:space="preserve"> </w:t>
+            </w:r>
+            <w:r>
+              <w:rPr>
+                <w:rStyle w:val="Hyperlink"/>
+                <w:b/>
+                <w:color w:val="000000" w:themeColor="text1"/>
+                <w:sz w:val="36"/>
+                <w:u w:val="none"/>
+              </w:rPr>
               <w:t>KUMAR</w:t>
             </w:r>
             <w:r>
               <w:rPr>
+                <w:rStyle w:val="Hyperlink"/>
                 <w:b/>
+                <w:color w:val="000000" w:themeColor="text1"/>
                 <w:sz w:val="36"/>
+                <w:u w:val="none"/>
               </w:rPr>
               <w:br/>
               <w:t>GUPTA</w:t>
+            </w:r>
+            <w:r>
+              <w:rPr>
+                <w:b/>
+                <w:color w:val="000000" w:themeColor="text1"/>
+                <w:sz w:val="36"/>
+              </w:rPr>
+              <w:fldChar w:fldCharType="end"/>
             </w:r>
           </w:p>
           <w:p>
@@ -527,14 +585,22 @@
           <w:p>
             <w:pPr>
               <w:spacing w:after="0"/>
+              <w:rPr>
+                <w:color w:val="000000" w:themeColor="text1"/>
+              </w:rPr>
             </w:pPr>
-            <w:r>
-              <w:rPr>
-                <w:b/>
-                <w:sz w:val="34"/>
-              </w:rPr>
-              <w:t>RAVI KUMAR GUPTA</w:t>
-            </w:r>
+            <w:hyperlink r:id="rId10" w:history="1">
+              <w:r>
+                <w:rPr>
+                  <w:rStyle w:val="Hyperlink"/>
+                  <w:b/>
+                  <w:color w:val="000000" w:themeColor="text1"/>
+                  <w:sz w:val="34"/>
+                  <w:u w:val="none"/>
+                </w:rPr>
+                <w:t>RAVI KUMAR GUPTA</w:t>
+              </w:r>
+            </w:hyperlink>
           </w:p>
           <w:p>
             <w:pPr>
@@ -1061,31 +1127,53 @@
           <w:p>
             <w:pPr>
               <w:spacing w:after="20"/>
+              <w:rPr>
+                <w:color w:val="000000" w:themeColor="text1"/>
+              </w:rPr>
             </w:pPr>
-            <w:r>
-              <w:rPr>
-                <w:b/>
-                <w:sz w:val="34"/>
-              </w:rPr>
-              <w:lastRenderedPageBreak/>
-              <w:t>RAVI</w:t>
-            </w:r>
-            <w:r>
-              <w:rPr>
-                <w:b/>
-                <w:sz w:val="34"/>
-              </w:rPr>
-              <w:br/>
-              <w:t>KUMAR</w:t>
-            </w:r>
-            <w:r>
-              <w:rPr>
-                <w:b/>
-                <w:sz w:val="34"/>
-              </w:rPr>
-              <w:br/>
-              <w:t>GUPTA</w:t>
-            </w:r>
+            <w:hyperlink r:id="rId11" w:history="1">
+              <w:r>
+                <w:rPr>
+                  <w:rStyle w:val="Hyperlink"/>
+                  <w:b/>
+                  <w:color w:val="000000" w:themeColor="text1"/>
+                  <w:sz w:val="34"/>
+                  <w:u w:val="none"/>
+                </w:rPr>
+                <w:t>RAVI</w:t>
+              </w:r>
+              <w:r>
+                <w:rPr>
+                  <w:rStyle w:val="Hyperlink"/>
+                  <w:b/>
+                  <w:color w:val="000000" w:themeColor="text1"/>
+                  <w:sz w:val="34"/>
+                  <w:u w:val="none"/>
+                </w:rPr>
+                <w:t xml:space="preserve"> </w:t>
+              </w:r>
+              <w:r>
+                <w:rPr>
+                  <w:rStyle w:val="Hyperlink"/>
+                  <w:b/>
+                  <w:color w:val="000000" w:themeColor="text1"/>
+                  <w:sz w:val="34"/>
+                  <w:u w:val="none"/>
+                </w:rPr>
+                <w:t>KUMAR</w:t>
+              </w:r>
+              <w:r>
+                <w:rPr>
+                  <w:rStyle w:val="Hyperlink"/>
+                  <w:b/>
+                  <w:color w:val="000000" w:themeColor="text1"/>
+                  <w:sz w:val="34"/>
+                  <w:u w:val="none"/>
+                </w:rPr>
+                <w:br/>
+                <w:t>GUPTA</w:t>
+              </w:r>
+            </w:hyperlink>
           </w:p>
           <w:p>
             <w:pPr>
@@ -1733,7 +1821,7 @@
     </w:tbl>
     <w:p/>
     <w:sectPr>
-      <w:footerReference w:type="default" r:id="rId10"/>
+      <w:footerReference w:type="default" r:id="rId12"/>
       <w:pgSz w:w="12240" w:h="15840"/>
       <w:pgMar w:top="547" w:right="648" w:bottom="547" w:left="648" w:header="720" w:footer="720" w:gutter="0"/>
       <w:cols w:space="720"/>
@@ -13767,4 +13855,10 @@
     <ds:schemaRef ds:uri="http://schemas.openxmlformats.org/officeDocument/2006/bibliography"/>
   </ds:schemaRefs>
 </ds:datastoreItem>
+</file>
+
+<file path=docMetadata/LabelInfo.xml><?xml version="1.0" encoding="utf-8"?>
+<clbl:labelList xmlns:clbl="http://schemas.microsoft.com/office/2020/mipLabelMetadata">
+  <clbl:label id="{0cf7ac0a-4681-4823-ab0b-04ef02c5f873}" enabled="1" method="Standard" siteId="{42f7676c-f455-423c-82f6-dc2d99791af7}" contentBits="0" removed="0"/>
+</clbl:labelList>
 </file>
</xml_diff>